<commit_message>
fix: write get_pr engine logs under root_path; strip screenshot meta from user guide
</commit_message>
<xml_diff>
--- a/docs/USER_GUIDE.docx
+++ b/docs/USER_GUIDE.docx
@@ -35,43 +35,7 @@
     </w:p>
     <w:p>
       <w:r>
-        <w:t xml:space="preserve">This guide walks the whole flow on </w:t>
-      </w:r>
-      <w:r>
-        <w:rPr>
-          <w:b/>
-        </w:rPr>
-        <w:t xml:space="preserve">your real inputs</w:t>
-      </w:r>
-      <w:r>
-        <w:t xml:space="preserve">, from Setup through the outlier cross-check.</w:t>
-      </w:r>
-    </w:p>
-    <w:p>
-      <w:pPr>
-        <w:pBdr>
-          <w:left w:val="single" w:sz="18" w:space="8" w:color="BBBBBB"/>
-        </w:pBdr>
-        <w:ind w:left="240"/>
-      </w:pPr>
-      <w:r>
-        <w:rPr>
-          <w:b/>
-        </w:rPr>
-        <w:t xml:space="preserve">About the screenshots in this guide.</w:t>
-      </w:r>
-      <w:r>
-        <w:t xml:space="preserve"> Each step has a callout that tells you exactly which screen to capture and the file name to save it under (</w:t>
-      </w:r>
-      <w:r>
-        <w:rPr>
-          <w:rFonts w:ascii="Consolas" w:hAnsi="Consolas"/>
-          <w:shd w:val="clear" w:fill="F2F2F2"/>
-        </w:rPr>
-        <w:t xml:space="preserve">docs/images/NN_*.png</w:t>
-      </w:r>
-      <w:r>
-        <w:t xml:space="preserve">). The placeholder frames you currently see are meant to be replaced with screenshots from your own run. See §8 Adding your screenshots.</w:t>
+        <w:t xml:space="preserve">This guide walks the whole flow on real inputs, from Setup through the outlier cross-check.</w:t>
       </w:r>
     </w:p>
     <w:p>
@@ -164,17 +128,6 @@
       </w:pPr>
       <w:r>
         <w:t xml:space="preserve">Waivers — terminology</w:t>
-      </w:r>
-    </w:p>
-    <w:p>
-      <w:pPr>
-        <w:numPr>
-          <w:ilvl w:val="0"/>
-          <w:numId w:val="2"/>
-        </w:numPr>
-      </w:pPr>
-      <w:r>
-        <w:t xml:space="preserve">Adding your screenshots</w:t>
       </w:r>
     </w:p>
     <w:p>
@@ -1619,44 +1572,6 @@
       </w:r>
       <w:r>
         <w:t xml:space="preserve">. Moments (meanshift / std / skew) are derived from the FMC data — no separate Full-MC run is needed.</w:t>
-      </w:r>
-    </w:p>
-    <w:p>
-      <w:pPr>
-        <w:pBdr>
-          <w:left w:val="single" w:sz="18" w:space="8" w:color="BBBBBB"/>
-        </w:pBdr>
-        <w:ind w:left="240"/>
-      </w:pPr>
-      <w:r>
-        <w:t xml:space="preserve">📸 </w:t>
-      </w:r>
-      <w:r>
-        <w:rPr>
-          <w:b/>
-        </w:rPr>
-        <w:t xml:space="preserve">Screenshot needed → save as `docs/images/01_setup.png`</w:t>
-      </w:r>
-      <w:r>
-        <w:t xml:space="preserve"> Capture the </w:t>
-      </w:r>
-      <w:r>
-        <w:rPr>
-          <w:b/>
-        </w:rPr>
-        <w:t xml:space="preserve">Setup</w:t>
-      </w:r>
-      <w:r>
-        <w:t xml:space="preserve"> tab after you've filled in vendor/process/corners and browsed to your input folders, just before clicking </w:t>
-      </w:r>
-      <w:r>
-        <w:rPr>
-          <w:b/>
-        </w:rPr>
-        <w:t xml:space="preserve">Run certification</w:t>
-      </w:r>
-      <w:r>
-        <w:t xml:space="preserve">.</w:t>
       </w:r>
     </w:p>
     <w:p>
@@ -1726,35 +1641,6 @@
       </w:r>
     </w:p>
     <w:p>
-      <w:pPr>
-        <w:pBdr>
-          <w:left w:val="single" w:sz="18" w:space="8" w:color="BBBBBB"/>
-        </w:pBdr>
-        <w:ind w:left="240"/>
-      </w:pPr>
-      <w:r>
-        <w:t xml:space="preserve">📸 </w:t>
-      </w:r>
-      <w:r>
-        <w:rPr>
-          <w:b/>
-        </w:rPr>
-        <w:t xml:space="preserve">Screenshot needed → save as `docs/images/02_pipeline.png`</w:t>
-      </w:r>
-      <w:r>
-        <w:t xml:space="preserve"> Capture the </w:t>
-      </w:r>
-      <w:r>
-        <w:rPr>
-          <w:b/>
-        </w:rPr>
-        <w:t xml:space="preserve">Pipeline</w:t>
-      </w:r>
-      <w:r>
-        <w:t xml:space="preserve"> tab during or just after a run, showing the stage list and any audit findings.</w:t>
-      </w:r>
-    </w:p>
-    <w:p>
       <w:r>
         <w:drawing>
           <wp:inline distT="0" distB="0" distL="0" distR="0">
@@ -1966,55 +1852,6 @@
       </w:r>
     </w:p>
     <w:p>
-      <w:pPr>
-        <w:pBdr>
-          <w:left w:val="single" w:sz="18" w:space="8" w:color="BBBBBB"/>
-        </w:pBdr>
-        <w:ind w:left="240"/>
-      </w:pPr>
-      <w:r>
-        <w:t xml:space="preserve">📸 </w:t>
-      </w:r>
-      <w:r>
-        <w:rPr>
-          <w:b/>
-        </w:rPr>
-        <w:t xml:space="preserve">Screenshot needed → save as `docs/images/03_results.png`</w:t>
-      </w:r>
-      <w:r>
-        <w:t xml:space="preserve"> Capture the </w:t>
-      </w:r>
-      <w:r>
-        <w:rPr>
-          <w:b/>
-        </w:rPr>
-        <w:t xml:space="preserve">Results</w:t>
-      </w:r>
-      <w:r>
-        <w:t xml:space="preserve"> tab with the basis radios visible. If your data tells a good story, grab one screenshot per basis (Base vs +Waiver1 vs +Waiver2) and add </w:t>
-      </w:r>
-      <w:r>
-        <w:rPr>
-          <w:rFonts w:ascii="Consolas" w:hAnsi="Consolas"/>
-          <w:shd w:val="clear" w:fill="F2F2F2"/>
-        </w:rPr>
-        <w:t xml:space="preserve">03b_*</w:t>
-      </w:r>
-      <w:r>
-        <w:t xml:space="preserve"> / </w:t>
-      </w:r>
-      <w:r>
-        <w:rPr>
-          <w:rFonts w:ascii="Consolas" w:hAnsi="Consolas"/>
-          <w:shd w:val="clear" w:fill="F2F2F2"/>
-        </w:rPr>
-        <w:t xml:space="preserve">03c_*</w:t>
-      </w:r>
-      <w:r>
-        <w:t xml:space="preserve"> files of your own.</w:t>
-      </w:r>
-    </w:p>
-    <w:p>
       <w:r>
         <w:drawing>
           <wp:inline distT="0" distB="0" distL="0" distR="0">
@@ -2089,44 +1926,6 @@
       </w:r>
     </w:p>
     <w:p>
-      <w:pPr>
-        <w:pBdr>
-          <w:left w:val="single" w:sz="18" w:space="8" w:color="BBBBBB"/>
-        </w:pBdr>
-        <w:ind w:left="240"/>
-      </w:pPr>
-      <w:r>
-        <w:t xml:space="preserve">📸 </w:t>
-      </w:r>
-      <w:r>
-        <w:rPr>
-          <w:b/>
-        </w:rPr>
-        <w:t xml:space="preserve">Screenshot needed → save as `docs/images/04_pr_status.png`</w:t>
-      </w:r>
-      <w:r>
-        <w:t xml:space="preserve"> Capture the </w:t>
-      </w:r>
-      <w:r>
-        <w:rPr>
-          <w:b/>
-        </w:rPr>
-        <w:t xml:space="preserve">PR Status</w:t>
-      </w:r>
-      <w:r>
-        <w:t xml:space="preserve"> pivot after clicking </w:t>
-      </w:r>
-      <w:r>
-        <w:rPr>
-          <w:b/>
-        </w:rPr>
-        <w:t xml:space="preserve">Build</w:t>
-      </w:r>
-      <w:r>
-        <w:t xml:space="preserve">, with a basis selected.</w:t>
-      </w:r>
-    </w:p>
-    <w:p>
       <w:r>
         <w:drawing>
           <wp:inline distT="0" distB="0" distL="0" distR="0">
@@ -2241,53 +2040,6 @@
       </w:r>
     </w:p>
     <w:p>
-      <w:pPr>
-        <w:pBdr>
-          <w:left w:val="single" w:sz="18" w:space="8" w:color="BBBBBB"/>
-        </w:pBdr>
-        <w:ind w:left="240"/>
-      </w:pPr>
-      <w:r>
-        <w:t xml:space="preserve">📸 </w:t>
-      </w:r>
-      <w:r>
-        <w:rPr>
-          <w:b/>
-        </w:rPr>
-        <w:t xml:space="preserve">Screenshot needed → save as `docs/images/05_outliers.png`</w:t>
-      </w:r>
-      <w:r>
-        <w:t xml:space="preserve"> Capture the </w:t>
-      </w:r>
-      <w:r>
-        <w:rPr>
-          <w:b/>
-        </w:rPr>
-        <w:t xml:space="preserve">Outliers</w:t>
-      </w:r>
-      <w:r>
-        <w:t xml:space="preserve"> table after </w:t>
-      </w:r>
-      <w:r>
-        <w:rPr>
-          <w:b/>
-        </w:rPr>
-        <w:t xml:space="preserve">Build</w:t>
-      </w:r>
-      <w:r>
-        <w:t xml:space="preserve">, on the </w:t>
-      </w:r>
-      <w:r>
-        <w:rPr>
-          <w:b/>
-        </w:rPr>
-        <w:t xml:space="preserve">Base</w:t>
-      </w:r>
-      <w:r>
-        <w:t xml:space="preserve"> basis so the breakdown columns are populated.</w:t>
-      </w:r>
-    </w:p>
-    <w:p>
       <w:r>
         <w:drawing>
           <wp:inline distT="0" distB="0" distL="0" distR="0">
@@ -2435,26 +2187,6 @@
       </w:r>
     </w:p>
     <w:p>
-      <w:pPr>
-        <w:pBdr>
-          <w:left w:val="single" w:sz="18" w:space="8" w:color="BBBBBB"/>
-        </w:pBdr>
-        <w:ind w:left="240"/>
-      </w:pPr>
-      <w:r>
-        <w:t xml:space="preserve">📸 </w:t>
-      </w:r>
-      <w:r>
-        <w:rPr>
-          <w:b/>
-        </w:rPr>
-        <w:t xml:space="preserve">Screenshot needed → save as `docs/images/06_outlier_drill.png`</w:t>
-      </w:r>
-      <w:r>
-        <w:t xml:space="preserve"> Capture the drill-down window: the Lib-vs-MC scatter plus the worst-arc / source trace-back panel.</w:t>
-      </w:r>
-    </w:p>
-    <w:p>
       <w:r>
         <w:drawing>
           <wp:inline distT="0" distB="0" distL="0" distR="0">
@@ -2530,35 +2262,6 @@
       </w:r>
     </w:p>
     <w:p>
-      <w:pPr>
-        <w:pBdr>
-          <w:left w:val="single" w:sz="18" w:space="8" w:color="BBBBBB"/>
-        </w:pBdr>
-        <w:ind w:left="240"/>
-      </w:pPr>
-      <w:r>
-        <w:t xml:space="preserve">📸 </w:t>
-      </w:r>
-      <w:r>
-        <w:rPr>
-          <w:b/>
-        </w:rPr>
-        <w:t xml:space="preserve">Screenshot needed → save as `docs/images/07_common.png`</w:t>
-      </w:r>
-      <w:r>
-        <w:t xml:space="preserve"> Capture the </w:t>
-      </w:r>
-      <w:r>
-        <w:rPr>
-          <w:b/>
-        </w:rPr>
-        <w:t xml:space="preserve">Common</w:t>
-      </w:r>
-      <w:r>
-        <w:t xml:space="preserve"> tab after grouping, ideally with several batches selected in History.</w:t>
-      </w:r>
-    </w:p>
-    <w:p>
       <w:r>
         <w:drawing>
           <wp:inline distT="0" distB="0" distL="0" distR="0">
@@ -2649,35 +2352,6 @@
       </w:r>
     </w:p>
     <w:p>
-      <w:pPr>
-        <w:pBdr>
-          <w:left w:val="single" w:sz="18" w:space="8" w:color="BBBBBB"/>
-        </w:pBdr>
-        <w:ind w:left="240"/>
-      </w:pPr>
-      <w:r>
-        <w:t xml:space="preserve">📸 </w:t>
-      </w:r>
-      <w:r>
-        <w:rPr>
-          <w:b/>
-        </w:rPr>
-        <w:t xml:space="preserve">Screenshot needed → save as `docs/images/08_history.png`</w:t>
-      </w:r>
-      <w:r>
-        <w:t xml:space="preserve"> Capture the </w:t>
-      </w:r>
-      <w:r>
-        <w:rPr>
-          <w:b/>
-        </w:rPr>
-        <w:t xml:space="preserve">History</w:t>
-      </w:r>
-      <w:r>
-        <w:t xml:space="preserve"> tab showing one or more completed runs.</w:t>
-      </w:r>
-    </w:p>
-    <w:p>
       <w:r>
         <w:drawing>
           <wp:inline distT="0" distB="0" distL="0" distR="0">
@@ -2889,467 +2563,7 @@
         <w:pStyle w:val="Heading2"/>
       </w:pPr>
       <w:r>
-        <w:t xml:space="preserve">8. Adding your screenshots</w:t>
-      </w:r>
-    </w:p>
-    <w:p>
-      <w:r>
-        <w:t xml:space="preserve">Every figure in this guide lives in </w:t>
-      </w:r>
-      <w:r>
-        <w:rPr>
-          <w:rFonts w:ascii="Consolas" w:hAnsi="Consolas"/>
-          <w:shd w:val="clear" w:fill="F2F2F2"/>
-        </w:rPr>
-        <w:t xml:space="preserve">docs/images/</w:t>
-      </w:r>
-      <w:r>
-        <w:t xml:space="preserve"> and is referenced with a relative path (e.g. </w:t>
-      </w:r>
-      <w:r>
-        <w:rPr>
-          <w:rFonts w:ascii="Consolas" w:hAnsi="Consolas"/>
-          <w:shd w:val="clear" w:fill="F2F2F2"/>
-        </w:rPr>
-        <w:t xml:space="preserve">images/01_setup.png</w:t>
-      </w:r>
-      <w:r>
-        <w:t xml:space="preserve">), so the links resolve both on GitHub and in the exported Word document.</w:t>
-      </w:r>
-    </w:p>
-    <w:p>
-      <w:r>
-        <w:t xml:space="preserve">To add a real screenshot, </w:t>
-      </w:r>
-      <w:r>
-        <w:rPr>
-          <w:b/>
-        </w:rPr>
-        <w:t xml:space="preserve">save your capture over the matching placeholder</w:t>
-      </w:r>
-      <w:r>
-        <w:t xml:space="preserve">, keeping the file name:</w:t>
-      </w:r>
-    </w:p>
-    <w:tbl>
-      <w:tblPr>
-        <w:tblStyle w:val="TableGrid"/>
-        <w:tblW w:w="0" w:type="auto"/>
-        <w:tblBorders>
-          <w:top w:val="single" w:sz="4" w:color="999999"/>
-          <w:left w:val="single" w:sz="4" w:color="999999"/>
-          <w:bottom w:val="single" w:sz="4" w:color="999999"/>
-          <w:right w:val="single" w:sz="4" w:color="999999"/>
-          <w:insideH w:val="single" w:sz="4" w:color="999999"/>
-          <w:insideV w:val="single" w:sz="4" w:color="999999"/>
-        </w:tblBorders>
-      </w:tblPr>
-      <w:tblGrid>
-        <w:gridCol w:w="2400"/>
-        <w:gridCol w:w="2400"/>
-      </w:tblGrid>
-      <w:tr>
-        <w:tc>
-          <w:tcPr>
-            <w:tcW w:w="0" w:type="auto"/>
-            <w:shd w:val="clear" w:fill="EEEEEE"/>
-          </w:tcPr>
-          <w:p>
-            <w:r>
-              <w:rPr>
-                <w:b/>
-              </w:rPr>
-              <w:t xml:space="preserve">Step</w:t>
-            </w:r>
-          </w:p>
-        </w:tc>
-        <w:tc>
-          <w:tcPr>
-            <w:tcW w:w="0" w:type="auto"/>
-            <w:shd w:val="clear" w:fill="EEEEEE"/>
-          </w:tcPr>
-          <w:p>
-            <w:r>
-              <w:rPr>
-                <w:b/>
-              </w:rPr>
-              <w:t xml:space="preserve">File to replace</w:t>
-            </w:r>
-          </w:p>
-        </w:tc>
-      </w:tr>
-      <w:tr>
-        <w:tc>
-          <w:tcPr>
-            <w:tcW w:w="0" w:type="auto"/>
-          </w:tcPr>
-          <w:p>
-            <w:r>
-              <w:t xml:space="preserve">6.1 Setup</w:t>
-            </w:r>
-          </w:p>
-        </w:tc>
-        <w:tc>
-          <w:tcPr>
-            <w:tcW w:w="0" w:type="auto"/>
-          </w:tcPr>
-          <w:p>
-            <w:r>
-              <w:rPr>
-                <w:rFonts w:ascii="Consolas" w:hAnsi="Consolas"/>
-                <w:shd w:val="clear" w:fill="F2F2F2"/>
-              </w:rPr>
-              <w:t xml:space="preserve">docs/images/01_setup.png</w:t>
-            </w:r>
-          </w:p>
-        </w:tc>
-      </w:tr>
-      <w:tr>
-        <w:tc>
-          <w:tcPr>
-            <w:tcW w:w="0" w:type="auto"/>
-          </w:tcPr>
-          <w:p>
-            <w:r>
-              <w:t xml:space="preserve">6.2 Pipeline</w:t>
-            </w:r>
-          </w:p>
-        </w:tc>
-        <w:tc>
-          <w:tcPr>
-            <w:tcW w:w="0" w:type="auto"/>
-          </w:tcPr>
-          <w:p>
-            <w:r>
-              <w:rPr>
-                <w:rFonts w:ascii="Consolas" w:hAnsi="Consolas"/>
-                <w:shd w:val="clear" w:fill="F2F2F2"/>
-              </w:rPr>
-              <w:t xml:space="preserve">docs/images/02_pipeline.png</w:t>
-            </w:r>
-          </w:p>
-        </w:tc>
-      </w:tr>
-      <w:tr>
-        <w:tc>
-          <w:tcPr>
-            <w:tcW w:w="0" w:type="auto"/>
-          </w:tcPr>
-          <w:p>
-            <w:r>
-              <w:t xml:space="preserve">6.3 Results</w:t>
-            </w:r>
-          </w:p>
-        </w:tc>
-        <w:tc>
-          <w:tcPr>
-            <w:tcW w:w="0" w:type="auto"/>
-          </w:tcPr>
-          <w:p>
-            <w:r>
-              <w:rPr>
-                <w:rFonts w:ascii="Consolas" w:hAnsi="Consolas"/>
-                <w:shd w:val="clear" w:fill="F2F2F2"/>
-              </w:rPr>
-              <w:t xml:space="preserve">docs/images/03_results.png</w:t>
-            </w:r>
-          </w:p>
-        </w:tc>
-      </w:tr>
-      <w:tr>
-        <w:tc>
-          <w:tcPr>
-            <w:tcW w:w="0" w:type="auto"/>
-          </w:tcPr>
-          <w:p>
-            <w:r>
-              <w:t xml:space="preserve">6.4 PR Status</w:t>
-            </w:r>
-          </w:p>
-        </w:tc>
-        <w:tc>
-          <w:tcPr>
-            <w:tcW w:w="0" w:type="auto"/>
-          </w:tcPr>
-          <w:p>
-            <w:r>
-              <w:rPr>
-                <w:rFonts w:ascii="Consolas" w:hAnsi="Consolas"/>
-                <w:shd w:val="clear" w:fill="F2F2F2"/>
-              </w:rPr>
-              <w:t xml:space="preserve">docs/images/04_pr_status.png</w:t>
-            </w:r>
-          </w:p>
-        </w:tc>
-      </w:tr>
-      <w:tr>
-        <w:tc>
-          <w:tcPr>
-            <w:tcW w:w="0" w:type="auto"/>
-          </w:tcPr>
-          <w:p>
-            <w:r>
-              <w:t xml:space="preserve">6.5 Outliers</w:t>
-            </w:r>
-          </w:p>
-        </w:tc>
-        <w:tc>
-          <w:tcPr>
-            <w:tcW w:w="0" w:type="auto"/>
-          </w:tcPr>
-          <w:p>
-            <w:r>
-              <w:rPr>
-                <w:rFonts w:ascii="Consolas" w:hAnsi="Consolas"/>
-                <w:shd w:val="clear" w:fill="F2F2F2"/>
-              </w:rPr>
-              <w:t xml:space="preserve">docs/images/05_outliers.png</w:t>
-            </w:r>
-          </w:p>
-        </w:tc>
-      </w:tr>
-      <w:tr>
-        <w:tc>
-          <w:tcPr>
-            <w:tcW w:w="0" w:type="auto"/>
-          </w:tcPr>
-          <w:p>
-            <w:r>
-              <w:t xml:space="preserve">6.6 Outlier drill-down</w:t>
-            </w:r>
-          </w:p>
-        </w:tc>
-        <w:tc>
-          <w:tcPr>
-            <w:tcW w:w="0" w:type="auto"/>
-          </w:tcPr>
-          <w:p>
-            <w:r>
-              <w:rPr>
-                <w:rFonts w:ascii="Consolas" w:hAnsi="Consolas"/>
-                <w:shd w:val="clear" w:fill="F2F2F2"/>
-              </w:rPr>
-              <w:t xml:space="preserve">docs/images/06_outlier_drill.png</w:t>
-            </w:r>
-          </w:p>
-        </w:tc>
-      </w:tr>
-      <w:tr>
-        <w:tc>
-          <w:tcPr>
-            <w:tcW w:w="0" w:type="auto"/>
-          </w:tcPr>
-          <w:p>
-            <w:r>
-              <w:t xml:space="preserve">6.7 Common</w:t>
-            </w:r>
-          </w:p>
-        </w:tc>
-        <w:tc>
-          <w:tcPr>
-            <w:tcW w:w="0" w:type="auto"/>
-          </w:tcPr>
-          <w:p>
-            <w:r>
-              <w:rPr>
-                <w:rFonts w:ascii="Consolas" w:hAnsi="Consolas"/>
-                <w:shd w:val="clear" w:fill="F2F2F2"/>
-              </w:rPr>
-              <w:t xml:space="preserve">docs/images/07_common.png</w:t>
-            </w:r>
-          </w:p>
-        </w:tc>
-      </w:tr>
-      <w:tr>
-        <w:tc>
-          <w:tcPr>
-            <w:tcW w:w="0" w:type="auto"/>
-          </w:tcPr>
-          <w:p>
-            <w:r>
-              <w:t xml:space="preserve">6.8 History</w:t>
-            </w:r>
-          </w:p>
-        </w:tc>
-        <w:tc>
-          <w:tcPr>
-            <w:tcW w:w="0" w:type="auto"/>
-          </w:tcPr>
-          <w:p>
-            <w:r>
-              <w:rPr>
-                <w:rFonts w:ascii="Consolas" w:hAnsi="Consolas"/>
-                <w:shd w:val="clear" w:fill="F2F2F2"/>
-              </w:rPr>
-              <w:t xml:space="preserve">docs/images/08_history.png</w:t>
-            </w:r>
-          </w:p>
-        </w:tc>
-      </w:tr>
-    </w:tbl>
-    <w:p/>
-    <w:p>
-      <w:r>
-        <w:t xml:space="preserve">The placeholder frames currently in those files are solid grey boxes — once you drop in a real PNG with the same name, the guide and the exported Word document pick it up automatically.</w:t>
-      </w:r>
-    </w:p>
-    <w:p>
-      <w:pPr>
-        <w:pStyle w:val="Heading3"/>
-      </w:pPr>
-      <w:r>
-        <w:t xml:space="preserve">Exporting a Word document to share by email</w:t>
-      </w:r>
-    </w:p>
-    <w:p>
-      <w:r>
-        <w:t xml:space="preserve">A Word document </w:t>
-      </w:r>
-      <w:r>
-        <w:rPr>
-          <w:rFonts w:ascii="Consolas" w:hAnsi="Consolas"/>
-          <w:shd w:val="clear" w:fill="F2F2F2"/>
-        </w:rPr>
-        <w:t xml:space="preserve">docs/USER_GUIDE.docx</w:t>
-      </w:r>
-      <w:r>
-        <w:t xml:space="preserve"> is generated from this Markdown so you can attach it to an email. </w:t>
-      </w:r>
-      <w:r>
-        <w:rPr>
-          <w:b/>
-        </w:rPr>
-        <w:t xml:space="preserve">Regenerate it after you add your screenshots</w:t>
-      </w:r>
-      <w:r>
-        <w:t xml:space="preserve"> so they are embedded in the document:</w:t>
-      </w:r>
-    </w:p>
-    <w:p>
-      <w:pPr>
-        <w:shd w:val="clear" w:fill="F4F4F4"/>
-      </w:pPr>
-      <w:r>
-        <w:rPr>
-          <w:rFonts w:ascii="Consolas" w:hAnsi="Consolas"/>
-          <w:shd w:val="clear" w:fill="F4F4F4"/>
-        </w:rPr>
-        <w:t xml:space="preserve">python scripts/make_user_guide_doc.py</w:t>
-      </w:r>
-    </w:p>
-    <w:p>
-      <w:r>
-        <w:t xml:space="preserve">This converts </w:t>
-      </w:r>
-      <w:r>
-        <w:rPr>
-          <w:rFonts w:ascii="Consolas" w:hAnsi="Consolas"/>
-          <w:shd w:val="clear" w:fill="F2F2F2"/>
-        </w:rPr>
-        <w:t xml:space="preserve">docs/USER_GUIDE.md</w:t>
-      </w:r>
-      <w:r>
-        <w:t xml:space="preserve"> to </w:t>
-      </w:r>
-      <w:r>
-        <w:rPr>
-          <w:rFonts w:ascii="Consolas" w:hAnsi="Consolas"/>
-          <w:shd w:val="clear" w:fill="F2F2F2"/>
-        </w:rPr>
-        <w:t xml:space="preserve">docs/USER_GUIDE.docx</w:t>
-      </w:r>
-      <w:r>
-        <w:t xml:space="preserve">, </w:t>
-      </w:r>
-      <w:r>
-        <w:rPr>
-          <w:b/>
-        </w:rPr>
-        <w:t xml:space="preserve">embedding</w:t>
-      </w:r>
-      <w:r>
-        <w:t xml:space="preserve"> the screenshots from </w:t>
-      </w:r>
-      <w:r>
-        <w:rPr>
-          <w:rFonts w:ascii="Consolas" w:hAnsi="Consolas"/>
-          <w:shd w:val="clear" w:fill="F2F2F2"/>
-        </w:rPr>
-        <w:t xml:space="preserve">docs/images/</w:t>
-      </w:r>
-      <w:r>
-        <w:t xml:space="preserve"> directly into the file (one self-contained attachment). It uses only the Python standard library — no pandoc, LibreOffice, or pip packages required.</w:t>
-      </w:r>
-    </w:p>
-    <w:p>
-      <w:pPr>
-        <w:pBdr>
-          <w:left w:val="single" w:sz="18" w:space="8" w:color="BBBBBB"/>
-        </w:pBdr>
-        <w:ind w:left="240"/>
-      </w:pPr>
-      <w:r>
-        <w:rPr>
-          <w:b/>
-        </w:rPr>
-        <w:t xml:space="preserve">Need a legacy `.doc`?</w:t>
-      </w:r>
-      <w:r>
-        <w:t xml:space="preserve"> </w:t>
-      </w:r>
-      <w:r>
-        <w:rPr>
-          <w:rFonts w:ascii="Consolas" w:hAnsi="Consolas"/>
-          <w:shd w:val="clear" w:fill="F2F2F2"/>
-        </w:rPr>
-        <w:t xml:space="preserve">.docx</w:t>
-      </w:r>
-      <w:r>
-        <w:t xml:space="preserve"> opens in Word 2007+, Outlook's preview pane, Google Docs and LibreOffice. If a recipient specifically needs the old binary </w:t>
-      </w:r>
-      <w:r>
-        <w:rPr>
-          <w:rFonts w:ascii="Consolas" w:hAnsi="Consolas"/>
-          <w:shd w:val="clear" w:fill="F2F2F2"/>
-        </w:rPr>
-        <w:t xml:space="preserve">.doc</w:t>
-      </w:r>
-      <w:r>
-        <w:t xml:space="preserve">, open </w:t>
-      </w:r>
-      <w:r>
-        <w:rPr>
-          <w:rFonts w:ascii="Consolas" w:hAnsi="Consolas"/>
-          <w:shd w:val="clear" w:fill="F2F2F2"/>
-        </w:rPr>
-        <w:t xml:space="preserve">USER_GUIDE.docx</w:t>
-      </w:r>
-      <w:r>
-        <w:t xml:space="preserve"> in Word and </w:t>
-      </w:r>
-      <w:r>
-        <w:rPr>
-          <w:b/>
-        </w:rPr>
-        <w:t xml:space="preserve">Save As → Word 97-2003 (.doc)</w:t>
-      </w:r>
-      <w:r>
-        <w:t xml:space="preserve">.</w:t>
-      </w:r>
-    </w:p>
-    <w:p>
-      <w:pPr>
-        <w:pBdr>
-          <w:bottom w:val="single" w:sz="6" w:space="1" w:color="CCCCCC"/>
-        </w:pBdr>
-      </w:pPr>
-    </w:p>
-    <w:p>
-      <w:pPr>
-        <w:pStyle w:val="Heading2"/>
-      </w:pPr>
-      <w:r>
-        <w:t xml:space="preserve">9. Troubleshooting</w:t>
+        <w:t xml:space="preserve">8. Troubleshooting</w:t>
       </w:r>
     </w:p>
     <w:tbl>

</xml_diff>